<commit_message>
Fix Research Policy highlights length and add word-count note
Co-Authored-By: Tatsuki Onishi <bougtoir@gmail.com>
</commit_message>
<xml_diff>
--- a/researcher_mobility_ode/docs/manuscript_research_policy.docx
+++ b/researcher_mobility_ode/docs/manuscript_research_policy.docx
@@ -21,6 +21,22 @@
       </w:pPr>
       <w:r>
         <w:t>Article type: Research Article / Research Note (to be confirmed)</w:t>
+      </w:r>
+    </w:p>
+    <w:p>
+      <w:pPr>
+        <w:jc w:val="center"/>
+      </w:pPr>
+      <w:r>
+        <w:t>Approximate word count (main text incl. tables, excl. references): 1202</w:t>
+      </w:r>
+    </w:p>
+    <w:p>
+      <w:pPr>
+        <w:jc w:val="center"/>
+      </w:pPr>
+      <w:r>
+        <w:t>Note: Research Policy Full Article target is ~8,000–10,000 words; Research Note is 3,000–5,000 words. Expand or select article type accordingly.</w:t>
       </w:r>
     </w:p>
     <w:p>
@@ -73,7 +89,7 @@
         <w:pStyle w:val="ListBullet"/>
       </w:pPr>
       <w:r>
-        <w:t>Nine modified Huntington civilisations are modelled as coupled six-compartment ODEs fitted to OpenAlex AI/ML data.</w:t>
+        <w:t>Nine civilisations modelled as six-compartment ODEs fitted to OpenAlex AI/ML data.</w:t>
       </w:r>
     </w:p>
     <w:p>
@@ -81,7 +97,7 @@
         <w:pStyle w:val="ListBullet"/>
       </w:pPr>
       <w:r>
-        <w:t>The closest point of no return is the Japanese PI pool, requiring only a 0.58 proportional change in d.</w:t>
+        <w:t>Closest point of no return is Japanese PI pool; d needs only 0.58 proportional change.</w:t>
       </w:r>
     </w:p>
     <w:p>
@@ -89,7 +105,7 @@
         <w:pStyle w:val="ListBullet"/>
       </w:pPr>
       <w:r>
-        <w:t>Dropout has the largest negative elasticity (~-2), while PI-driven inflow and domestic promotion (p_D) dominate positive leverage.</w:t>
+        <w:t>Dropout most negative; PI inflow and domestic promotion most positive.</w:t>
       </w:r>
     </w:p>
     <w:p>

</xml_diff>